<commit_message>
Actualizar Iguana-Ciclo-2026-09.docx con POV de pantalla y reel del CEO corto
Co-Authored-By: Claude Sonnet 5.5 <noreply@anthropic.com>
Claude-Session: https://claude.ai/code/session_01Eo7k34N4Qkf1EJ34PyMCX4
</commit_message>
<xml_diff>
--- a/content/cycles/2026-09/Iguana-Ciclo-2026-09.docx
+++ b/content/cycles/2026-09/Iguana-Ciclo-2026-09.docx
@@ -108,7 +108,7 @@
         <w:spacing w:after="80"/>
       </w:pPr>
       <w:r>
-        <w:t xml:space="preserve">Reel POV: se escenifica en un cuarto con luz de ventana (solo manos, la nuca de la “clienta” y un celular vibrando), con un remate nuevo: “Ya no importa, gracias”.</w:t>
+        <w:t xml:space="preserve">Hooks: se reescribieron en estilo humor + curiosidad (el que más te llama), con tres alternativas por reel.</w:t>
       </w:r>
     </w:p>
     <w:p>
@@ -121,7 +121,7 @@
         <w:spacing w:after="80"/>
       </w:pPr>
       <w:r>
-        <w:t xml:space="preserve">Reel del CEO: se reescribió para grabarse en una sola toma, sin credenciales inventadas (aún no hay clientes) y con el dato de citas perdidas citado con su alcance real.</w:t>
+        <w:t xml:space="preserve">Reel POV: pasa a ser de pantalla (~11 s): un celular real en una mano real, sin actores ni salón, con el chiste “Ya le contesto en 5 minutos” y el remate “Ya no importa, gracias”.</w:t>
       </w:r>
     </w:p>
     <w:p>
@@ -134,7 +134,7 @@
         <w:spacing w:after="80"/>
       </w:pPr>
       <w:r>
-        <w:t xml:space="preserve">Motion: sin grabación; solo se actualizó a la línea gráfica nueva.</w:t>
+        <w:t xml:space="preserve">Reel del CEO: baja a ≤ 22 s (~62 palabras) con una sola opinión, sin cifras ni credenciales inventadas (aún no hay clientes).</w:t>
       </w:r>
     </w:p>
     <w:p>
@@ -147,7 +147,20 @@
         <w:spacing w:after="80"/>
       </w:pPr>
       <w:r>
-        <w:t xml:space="preserve">Todo se produce en una sola sesión corta (07/10) y se publica en feed, potenciando desde ahí con boost manual.</w:t>
+        <w:t xml:space="preserve">Motion: sin grabación; solo se actualizó a la línea gráfica nueva.</w:t>
+      </w:r>
+    </w:p>
+    <w:p>
+      <w:pPr>
+        <w:pStyle w:val="ListParagraph"/>
+        <w:numPr>
+          <w:ilvl w:val="0"/>
+          <w:numId w:val="1"/>
+        </w:numPr>
+        <w:spacing w:after="80"/>
+      </w:pPr>
+      <w:r>
+        <w:t xml:space="preserve">Todo se produce en una sola sesión de ~60 min (07/10) y se publica en feed, potenciando desde ahí con boost manual. El motion (pieza 04) queda como estaba.</w:t>
       </w:r>
     </w:p>
     <w:p>
@@ -518,7 +531,7 @@
         <w:spacing w:after="200" w:before="400"/>
       </w:pPr>
       <w:r>
-        <w:t xml:space="preserve">3. Sesión única de producción (07/10, ~60-90 min)</w:t>
+        <w:t xml:space="preserve">3. Sesión única de producción (07/10, ~60 min)</w:t>
       </w:r>
     </w:p>
     <w:tbl>
@@ -836,7 +849,7 @@
                 <w:sz w:val="19"/>
                 <w:szCs w:val="19"/>
               </w:rPr>
-              <w:t xml:space="preserve">Reel POV</w:t>
+              <w:t xml:space="preserve">Reel POV de pantalla</w:t>
             </w:r>
           </w:p>
         </w:tc>
@@ -858,7 +871,7 @@
                 <w:sz w:val="19"/>
                 <w:szCs w:val="19"/>
               </w:rPr>
-              <w:t xml:space="preserve">Toma 1 continua + Toma 2 (insert al celular)</w:t>
+              <w:t xml:space="preserve">Un segundo celular filma el celular con el chat (3 intentos) + grabación de pantalla de respaldo. Los 4 mensajes ya se enviaron durante el día</w:t>
             </w:r>
           </w:p>
         </w:tc>
@@ -880,7 +893,7 @@
                 <w:sz w:val="19"/>
                 <w:szCs w:val="19"/>
               </w:rPr>
-              <w:t xml:space="preserve">CEO = manos/POV; marketing = “clienta” de espaldas</w:t>
+              <w:t xml:space="preserve">CEO sostiene el celular; marketing manda los mensajes y filma</w:t>
             </w:r>
           </w:p>
         </w:tc>
@@ -902,7 +915,7 @@
                 <w:sz w:val="19"/>
                 <w:szCs w:val="19"/>
               </w:rPr>
-              <w:t xml:space="preserve">20 min</w:t>
+              <w:t xml:space="preserve">10 min</w:t>
             </w:r>
           </w:p>
         </w:tc>
@@ -948,7 +961,7 @@
                 <w:sz w:val="19"/>
                 <w:szCs w:val="19"/>
               </w:rPr>
-              <w:t xml:space="preserve">Toma A continua (+ Toma B opcional)</w:t>
+              <w:t xml:space="preserve">Una toma continua de ≤ 22 s, 3 intentos</w:t>
             </w:r>
           </w:p>
         </w:tc>
@@ -970,7 +983,7 @@
                 <w:sz w:val="19"/>
                 <w:szCs w:val="19"/>
               </w:rPr>
-              <w:t xml:space="preserve">CEO a cámara; marketing sostiene la guía</w:t>
+              <w:t xml:space="preserve">CEO a cámara; marketing sostiene la guía y cuenta el tiempo</w:t>
             </w:r>
           </w:p>
         </w:tc>
@@ -992,7 +1005,7 @@
                 <w:sz w:val="19"/>
                 <w:szCs w:val="19"/>
               </w:rPr>
-              <w:t xml:space="preserve">20 min</w:t>
+              <w:t xml:space="preserve">15 min</w:t>
             </w:r>
           </w:p>
         </w:tc>
@@ -1082,7 +1095,7 @@
                 <w:sz w:val="19"/>
                 <w:szCs w:val="19"/>
               </w:rPr>
-              <w:t xml:space="preserve">10 min</w:t>
+              <w:t xml:space="preserve">5 min</w:t>
             </w:r>
           </w:p>
         </w:tc>
@@ -1113,7 +1126,7 @@
           <w:i/>
           <w:iCs/>
         </w:rPr>
-        <w:t xml:space="preserve">Props: 2 celulares, trípode o soporte, cuaderno y lapicero, post-it, capa o toalla, peine, cepillo y rociador (opcional), una silla, una mesa junto a una ventana, ropa negra/blanca/neutra sin logos. La foto de la estación de peluquería (slide 2) se toma aparte, en una peluquería amiga sin personas, o se usa stock libre.</w:t>
+        <w:t xml:space="preserve">Props: 2 celulares, trípode o soporte, cuaderno y lapicero, post-it, una mesa junto a una ventana y una lámpara cálida, ropa negra/blanca/neutra sin logos. Para el POV, antes de la sesión (durante el día): marketing manda los 4 mensajes al celular del CEO. La foto de la estación de peluquería (slide 2 del carrusel) se toma aparte, en una peluquería amiga sin personas, o se usa stock libre.</w:t>
       </w:r>
     </w:p>
     <w:p>
@@ -1454,7 +1467,7 @@
                 <w:sz w:val="19"/>
                 <w:szCs w:val="19"/>
               </w:rPr>
-              <w:t xml:space="preserve">Pieza 02 — POV: son las 6pm...</w:t>
+              <w:t xml:space="preserve">Pieza 02 — POV de pantalla: “Ya le contesto en 5 minutos”</w:t>
             </w:r>
           </w:p>
         </w:tc>
@@ -1544,7 +1557,7 @@
                 <w:sz w:val="19"/>
                 <w:szCs w:val="19"/>
               </w:rPr>
-              <w:t xml:space="preserve">Pieza 03 — El CEO opina sobre WhatsApp</w:t>
+              <w:t xml:space="preserve">Pieza 03 — El CEO: el segundo trabajo que nadie les paga</w:t>
             </w:r>
           </w:p>
         </w:tc>
@@ -2918,7 +2931,7 @@
         <w:spacing w:after="200" w:before="400"/>
       </w:pPr>
       <w:r>
-        <w:t xml:space="preserve">Pieza 02 — Reel POV: “Ya no importa, gracias”</w:t>
+        <w:t xml:space="preserve">Pieza 02 — Reel POV de pantalla: “Ya le contesto en 5 minutos”</w:t>
       </w:r>
     </w:p>
     <w:p>
@@ -2932,7 +2945,7 @@
           <w:i/>
           <w:iCs/>
         </w:rPr>
-        <w:t xml:space="preserve">Reel POV · 9:16 · ~16-19 s · IG + Facebook · Awareness · Escenificado, 2 tomas · Publica: 13/10</w:t>
+        <w:t xml:space="preserve">Reel POV · 9:16 · ~11 s (máx. 12) · IG + Facebook · Awareness · Sin actores ni salón · Publica: 13/10</w:t>
       </w:r>
     </w:p>
     <w:p>
@@ -2941,21 +2954,331 @@
         <w:spacing w:after="150" w:before="300"/>
       </w:pPr>
       <w:r>
-        <w:t xml:space="preserve">Hook</w:t>
-      </w:r>
-    </w:p>
+        <w:t xml:space="preserve">Hooks (humor y curiosidad)</w:t>
+      </w:r>
+    </w:p>
+    <w:tbl>
+      <w:tblPr>
+        <w:tblW w:type="dxa" w:w="10466"/>
+        <w:tblBorders>
+          <w:top w:val="single" w:color="auto" w:sz="4"/>
+          <w:left w:val="single" w:color="auto" w:sz="4"/>
+          <w:bottom w:val="single" w:color="auto" w:sz="4"/>
+          <w:right w:val="single" w:color="auto" w:sz="4"/>
+          <w:insideH w:val="single" w:color="auto" w:sz="4"/>
+          <w:insideV w:val="single" w:color="auto" w:sz="4"/>
+        </w:tblBorders>
+      </w:tblPr>
+      <w:tblGrid>
+        <w:gridCol w:w="1700"/>
+        <w:gridCol w:w="7266"/>
+        <w:gridCol w:w="1500"/>
+      </w:tblGrid>
+      <w:tr>
+        <w:tc>
+          <w:tcPr>
+            <w:tcW w:type="dxa" w:w="1700"/>
+            <w:shd w:fill="111111" w:val="clear"/>
+            <w:tcMar>
+              <w:top w:type="dxa" w:w="80"/>
+              <w:left w:type="dxa" w:w="100"/>
+              <w:bottom w:type="dxa" w:w="80"/>
+              <w:right w:type="dxa" w:w="100"/>
+            </w:tcMar>
+          </w:tcPr>
+          <w:p>
+            <w:r>
+              <w:rPr>
+                <w:b/>
+                <w:bCs/>
+                <w:color w:val="39FF14"/>
+                <w:sz w:val="19"/>
+                <w:szCs w:val="19"/>
+              </w:rPr>
+              <w:t xml:space="preserve">#</w:t>
+            </w:r>
+          </w:p>
+        </w:tc>
+        <w:tc>
+          <w:tcPr>
+            <w:tcW w:type="dxa" w:w="7266"/>
+            <w:shd w:fill="111111" w:val="clear"/>
+            <w:tcMar>
+              <w:top w:type="dxa" w:w="80"/>
+              <w:left w:type="dxa" w:w="100"/>
+              <w:bottom w:type="dxa" w:w="80"/>
+              <w:right w:type="dxa" w:w="100"/>
+            </w:tcMar>
+          </w:tcPr>
+          <w:p>
+            <w:r>
+              <w:rPr>
+                <w:b/>
+                <w:bCs/>
+                <w:color w:val="39FF14"/>
+                <w:sz w:val="19"/>
+                <w:szCs w:val="19"/>
+              </w:rPr>
+              <w:t xml:space="preserve">Texto en pantalla y qué se ve</w:t>
+            </w:r>
+          </w:p>
+        </w:tc>
+        <w:tc>
+          <w:tcPr>
+            <w:tcW w:type="dxa" w:w="1500"/>
+            <w:shd w:fill="111111" w:val="clear"/>
+            <w:tcMar>
+              <w:top w:type="dxa" w:w="80"/>
+              <w:left w:type="dxa" w:w="100"/>
+              <w:bottom w:type="dxa" w:w="80"/>
+              <w:right w:type="dxa" w:w="100"/>
+            </w:tcMar>
+          </w:tcPr>
+          <w:p>
+            <w:r>
+              <w:rPr>
+                <w:b/>
+                <w:bCs/>
+                <w:color w:val="39FF14"/>
+                <w:sz w:val="19"/>
+                <w:szCs w:val="19"/>
+              </w:rPr>
+              <w:t xml:space="preserve">Estilo</w:t>
+            </w:r>
+          </w:p>
+        </w:tc>
+      </w:tr>
+      <w:tr>
+        <w:tc>
+          <w:tcPr>
+            <w:tcW w:type="dxa" w:w="1700"/>
+            <w:tcMar>
+              <w:top w:type="dxa" w:w="80"/>
+              <w:left w:type="dxa" w:w="100"/>
+              <w:bottom w:type="dxa" w:w="80"/>
+              <w:right w:type="dxa" w:w="100"/>
+            </w:tcMar>
+          </w:tcPr>
+          <w:p>
+            <w:r>
+              <w:rPr>
+                <w:b w:val="false"/>
+                <w:bCs w:val="false"/>
+                <w:sz w:val="19"/>
+                <w:szCs w:val="19"/>
+              </w:rPr>
+              <w:t xml:space="preserve">1 (recomendado)</w:t>
+            </w:r>
+          </w:p>
+        </w:tc>
+        <w:tc>
+          <w:tcPr>
+            <w:tcW w:type="dxa" w:w="7266"/>
+            <w:tcMar>
+              <w:top w:type="dxa" w:w="80"/>
+              <w:left w:type="dxa" w:w="100"/>
+              <w:bottom w:type="dxa" w:w="80"/>
+              <w:right w:type="dxa" w:w="100"/>
+            </w:tcMar>
+          </w:tcPr>
+          <w:p>
+            <w:r>
+              <w:rPr>
+                <w:b w:val="false"/>
+                <w:bCs w:val="false"/>
+                <w:sz w:val="19"/>
+                <w:szCs w:val="19"/>
+              </w:rPr>
+              <w:t xml:space="preserve">“«Ya le contesto en 5 minutos»” → “Cinco minutos después:”. Una mano sostiene un celular en un cuarto en penumbra; zumbido de notificaciones.</w:t>
+            </w:r>
+          </w:p>
+        </w:tc>
+        <w:tc>
+          <w:tcPr>
+            <w:tcW w:type="dxa" w:w="1500"/>
+            <w:tcMar>
+              <w:top w:type="dxa" w:w="80"/>
+              <w:left w:type="dxa" w:w="100"/>
+              <w:bottom w:type="dxa" w:w="80"/>
+              <w:right w:type="dxa" w:w="100"/>
+            </w:tcMar>
+          </w:tcPr>
+          <w:p>
+            <w:r>
+              <w:rPr>
+                <w:b w:val="false"/>
+                <w:bCs w:val="false"/>
+                <w:sz w:val="19"/>
+                <w:szCs w:val="19"/>
+              </w:rPr>
+              <w:t xml:space="preserve">Humor</w:t>
+            </w:r>
+          </w:p>
+        </w:tc>
+      </w:tr>
+      <w:tr>
+        <w:tc>
+          <w:tcPr>
+            <w:tcW w:type="dxa" w:w="1700"/>
+            <w:tcMar>
+              <w:top w:type="dxa" w:w="80"/>
+              <w:left w:type="dxa" w:w="100"/>
+              <w:bottom w:type="dxa" w:w="80"/>
+              <w:right w:type="dxa" w:w="100"/>
+            </w:tcMar>
+          </w:tcPr>
+          <w:p>
+            <w:r>
+              <w:rPr>
+                <w:b w:val="false"/>
+                <w:bCs w:val="false"/>
+                <w:sz w:val="19"/>
+                <w:szCs w:val="19"/>
+              </w:rPr>
+              <w:t xml:space="preserve">2</w:t>
+            </w:r>
+          </w:p>
+        </w:tc>
+        <w:tc>
+          <w:tcPr>
+            <w:tcW w:type="dxa" w:w="7266"/>
+            <w:tcMar>
+              <w:top w:type="dxa" w:w="80"/>
+              <w:left w:type="dxa" w:w="100"/>
+              <w:bottom w:type="dxa" w:w="80"/>
+              <w:right w:type="dxa" w:w="100"/>
+            </w:tcMar>
+          </w:tcPr>
+          <w:p>
+            <w:r>
+              <w:rPr>
+                <w:b w:val="false"/>
+                <w:bCs w:val="false"/>
+                <w:sz w:val="19"/>
+                <w:szCs w:val="19"/>
+              </w:rPr>
+              <w:t xml:space="preserve">“Esto te escribieron mientras atendías a una sola clienta.” Celular en la mano con la lista de chats y un contador de no leídos.</w:t>
+            </w:r>
+          </w:p>
+        </w:tc>
+        <w:tc>
+          <w:tcPr>
+            <w:tcW w:type="dxa" w:w="1500"/>
+            <w:tcMar>
+              <w:top w:type="dxa" w:w="80"/>
+              <w:left w:type="dxa" w:w="100"/>
+              <w:bottom w:type="dxa" w:w="80"/>
+              <w:right w:type="dxa" w:w="100"/>
+            </w:tcMar>
+          </w:tcPr>
+          <w:p>
+            <w:r>
+              <w:rPr>
+                <w:b w:val="false"/>
+                <w:bCs w:val="false"/>
+                <w:sz w:val="19"/>
+                <w:szCs w:val="19"/>
+              </w:rPr>
+              <w:t xml:space="preserve">Curiosidad</w:t>
+            </w:r>
+          </w:p>
+        </w:tc>
+      </w:tr>
+      <w:tr>
+        <w:tc>
+          <w:tcPr>
+            <w:tcW w:type="dxa" w:w="1700"/>
+            <w:tcMar>
+              <w:top w:type="dxa" w:w="80"/>
+              <w:left w:type="dxa" w:w="100"/>
+              <w:bottom w:type="dxa" w:w="80"/>
+              <w:right w:type="dxa" w:w="100"/>
+            </w:tcMar>
+          </w:tcPr>
+          <w:p>
+            <w:r>
+              <w:rPr>
+                <w:b w:val="false"/>
+                <w:bCs w:val="false"/>
+                <w:sz w:val="19"/>
+                <w:szCs w:val="19"/>
+              </w:rPr>
+              <w:t xml:space="preserve">3</w:t>
+            </w:r>
+          </w:p>
+        </w:tc>
+        <w:tc>
+          <w:tcPr>
+            <w:tcW w:type="dxa" w:w="7266"/>
+            <w:tcMar>
+              <w:top w:type="dxa" w:w="80"/>
+              <w:left w:type="dxa" w:w="100"/>
+              <w:bottom w:type="dxa" w:w="80"/>
+              <w:right w:type="dxa" w:w="100"/>
+            </w:tcMar>
+          </w:tcPr>
+          <w:p>
+            <w:r>
+              <w:rPr>
+                <w:b w:val="false"/>
+                <w:bCs w:val="false"/>
+                <w:sz w:val="19"/>
+                <w:szCs w:val="19"/>
+              </w:rPr>
+              <w:t xml:space="preserve">“Tu WhatsApp cuando por fin lo miras a las 6pm.” Pulgar abriendo el chat; zumbido.</w:t>
+            </w:r>
+          </w:p>
+        </w:tc>
+        <w:tc>
+          <w:tcPr>
+            <w:tcW w:type="dxa" w:w="1500"/>
+            <w:tcMar>
+              <w:top w:type="dxa" w:w="80"/>
+              <w:left w:type="dxa" w:w="100"/>
+              <w:bottom w:type="dxa" w:w="80"/>
+              <w:right w:type="dxa" w:w="100"/>
+            </w:tcMar>
+          </w:tcPr>
+          <w:p>
+            <w:r>
+              <w:rPr>
+                <w:b w:val="false"/>
+                <w:bCs w:val="false"/>
+                <w:sz w:val="19"/>
+                <w:szCs w:val="19"/>
+              </w:rPr>
+              <w:t xml:space="preserve">Humor</w:t>
+            </w:r>
+          </w:p>
+        </w:tc>
+      </w:tr>
+    </w:tbl>
     <w:p>
       <w:pPr>
         <w:spacing w:after="120"/>
       </w:pPr>
       <w:r>
         <w:rPr>
-          <w:b/>
-          <w:bCs/>
+          <w:b w:val="false"/>
+          <w:bCs w:val="false"/>
           <w:i w:val="false"/>
           <w:iCs w:val="false"/>
         </w:rPr>
-        <w:t xml:space="preserve">“POV: son las 6pm, tienes clienta en la silla, y tu celular lleva 20 minutos vibrando sin parar.”</w:t>
+        <w:t xml:space="preserve"/>
+      </w:r>
+    </w:p>
+    <w:p>
+      <w:pPr>
+        <w:spacing w:after="120"/>
+      </w:pPr>
+      <w:r>
+        <w:rPr>
+          <w:b w:val="false"/>
+          <w:bCs w:val="false"/>
+          <w:i/>
+          <w:iCs/>
+        </w:rPr>
+        <w:t xml:space="preserve">Por qué el hook 1: es la frase que todo dueño de negocio se ha dicho, se entiende sin sonido y el corte promete el chiste antes del segundo 3.</w:t>
       </w:r>
     </w:p>
     <w:p>
@@ -2964,7 +3287,7 @@
         <w:spacing w:after="150" w:before="300"/>
       </w:pPr>
       <w:r>
-        <w:t xml:space="preserve">Escenificación sin salón</w:t>
+        <w:t xml:space="preserve">Idea y por qué es creíble</w:t>
       </w:r>
     </w:p>
     <w:p>
@@ -2977,7 +3300,7 @@
         <w:spacing w:after="80"/>
       </w:pPr>
       <w:r>
-        <w:t xml:space="preserve">Lugar: un cuarto con ventana (luz natural lateral) y pared neutra, sin logos ni objetos personales.</w:t>
+        <w:t xml:space="preserve">El protagonista es un celular real en una mano real: sin actores, sin salón, sin props. Es creíble en cualquier lugar.</w:t>
       </w:r>
     </w:p>
     <w:p>
@@ -2990,7 +3313,7 @@
         <w:spacing w:after="80"/>
       </w:pPr>
       <w:r>
-        <w:t xml:space="preserve">CEO = la dueña: solo se ven sus manos con peine/cepillo y su mirada subjetiva. Persona de marketing = la “clienta”, siempre de espaldas con una capa. Ningún rostro en cuadro. Pueden intercambiarse según quién tenga cabello para peinar.</w:t>
+        <w:t xml:space="preserve">Truco de autenticidad: la persona de marketing manda 4 mensajes a lo largo del día desde su WhatsApp, guardada en el celular del CEO como “Clienta nueva”. El CEO no contesta, así que las horas visibles son reales y la toma son ~10 minutos.</w:t>
       </w:r>
     </w:p>
     <w:p>
@@ -3003,20 +3326,7 @@
         <w:spacing w:after="80"/>
       </w:pPr>
       <w:r>
-        <w:t xml:space="preserve">Props: silla, capa o toalla, peine, cepillo, rociador (opcional) y un segundo celular que vibra apoyado en una repisa.</w:t>
-      </w:r>
-    </w:p>
-    <w:p>
-      <w:pPr>
-        <w:pStyle w:val="ListParagraph"/>
-        <w:numPr>
-          <w:ilvl w:val="0"/>
-          <w:numId w:val="1"/>
-        </w:numPr>
-        <w:spacing w:after="80"/>
-      </w:pPr>
-      <w:r>
-        <w:t xml:space="preserve">Es una escenificación: no cortar cabello de verdad ni presentarlo como un salón o clientes reales.</w:t>
+        <w:t xml:space="preserve">Los mensajes, en orden: “¿Tienes cupo hoy?” → “Hola??” → “¿Me confirmas?” → “Ya no importa, gracias 🙏” (el remate).</w:t>
       </w:r>
     </w:p>
     <w:p>
@@ -3025,7 +3335,7 @@
         <w:spacing w:after="150" w:before="300"/>
       </w:pPr>
       <w:r>
-        <w:t xml:space="preserve">Guion</w:t>
+        <w:t xml:space="preserve">Guion (~11 s)</w:t>
       </w:r>
     </w:p>
     <w:tbl>
@@ -3090,7 +3400,7 @@
                 <w:sz w:val="19"/>
                 <w:szCs w:val="19"/>
               </w:rPr>
-              <w:t xml:space="preserve">Qué se ve (POV)</w:t>
+              <w:t xml:space="preserve">Qué se ve</w:t>
             </w:r>
           </w:p>
         </w:tc>
@@ -3160,7 +3470,7 @@
                 <w:sz w:val="19"/>
                 <w:szCs w:val="19"/>
               </w:rPr>
-              <w:t xml:space="preserve">Manos peinando el cabello de la clienta (de espaldas); el segundo celular se enciende y vibra en la repisa.</w:t>
+              <w:t xml:space="preserve">Mano con el celular en penumbra; la pantalla se enciende con la lista de chats y un contador de no leídos.</w:t>
             </w:r>
           </w:p>
         </w:tc>
@@ -3182,7 +3492,7 @@
                 <w:sz w:val="19"/>
                 <w:szCs w:val="19"/>
               </w:rPr>
-              <w:t xml:space="preserve">Hook en pantalla. Vibración como pulso rítmico, sin música dramática.</w:t>
+              <w:t xml:space="preserve">“«Ya le contesto en 5 minutos»” (0-1.5 s) → “Cinco minutos después:” (marcador verde). Zumbido.</w:t>
             </w:r>
           </w:p>
         </w:tc>
@@ -3206,7 +3516,7 @@
                 <w:sz w:val="19"/>
                 <w:szCs w:val="19"/>
               </w:rPr>
-              <w:t xml:space="preserve">3-9 s</w:t>
+              <w:t xml:space="preserve">3-8 s</w:t>
             </w:r>
           </w:p>
         </w:tc>
@@ -3228,7 +3538,7 @@
                 <w:sz w:val="19"/>
                 <w:szCs w:val="19"/>
               </w:rPr>
-              <w:t xml:space="preserve">La mirada se desvía de reojo al celular sin soltar el cepillo.</w:t>
+              <w:t xml:space="preserve">El pulgar abre “Clienta nueva” y se ven los 4 mensajes con sus horas reales.</w:t>
             </w:r>
           </w:p>
         </w:tc>
@@ -3250,7 +3560,7 @@
                 <w:sz w:val="19"/>
                 <w:szCs w:val="19"/>
               </w:rPr>
-              <w:t xml:space="preserve">Banners superpuestos en edición: “¿Tienes cupo hoy?” → “Hola??” → “¿Me confirmas?” (opcional en voz baja: “Ya voy, ya voy...”).</w:t>
+              <w:t xml:space="preserve">Un “tin” por mensaje, ~1 s de distancia. Medio segundo de silencio antes de “Ya no importa, gracias 🙏”.</w:t>
             </w:r>
           </w:p>
         </w:tc>
@@ -3274,7 +3584,7 @@
                 <w:sz w:val="19"/>
                 <w:szCs w:val="19"/>
               </w:rPr>
-              <w:t xml:space="preserve">9-13 s</w:t>
+              <w:t xml:space="preserve">8-11 s</w:t>
             </w:r>
           </w:p>
         </w:tc>
@@ -3296,7 +3606,7 @@
                 <w:sz w:val="19"/>
                 <w:szCs w:val="19"/>
               </w:rPr>
-              <w:t xml:space="preserve">La clienta se levanta y sale de cuadro; recién ahora la mirada baja al celular (insert POV hacia abajo).</w:t>
+              <w:t xml:space="preserve">El chat con el último mensaje en primer plano.</w:t>
             </w:r>
           </w:p>
         </w:tc>
@@ -3318,148 +3628,95 @@
                 <w:sz w:val="19"/>
                 <w:szCs w:val="19"/>
               </w:rPr>
-              <w:t xml:space="preserve">Medio segundo de silencio y se corta el zumbido. Último banner: “Ya no importa, gracias 🙏”.</w:t>
-            </w:r>
-          </w:p>
-        </w:tc>
-      </w:tr>
-      <w:tr>
-        <w:tc>
-          <w:tcPr>
-            <w:tcW w:type="dxa" w:w="1100"/>
-            <w:tcMar>
-              <w:top w:type="dxa" w:w="80"/>
-              <w:left w:type="dxa" w:w="100"/>
-              <w:bottom w:type="dxa" w:w="80"/>
-              <w:right w:type="dxa" w:w="100"/>
-            </w:tcMar>
-          </w:tcPr>
-          <w:p>
-            <w:r>
-              <w:rPr>
-                <w:b w:val="false"/>
-                <w:bCs w:val="false"/>
-                <w:sz w:val="19"/>
-                <w:szCs w:val="19"/>
-              </w:rPr>
-              <w:t xml:space="preserve">13-16 s</w:t>
-            </w:r>
-          </w:p>
-        </w:tc>
-        <w:tc>
-          <w:tcPr>
-            <w:tcW w:type="dxa" w:w="4366"/>
-            <w:tcMar>
-              <w:top w:type="dxa" w:w="80"/>
-              <w:left w:type="dxa" w:w="100"/>
-              <w:bottom w:type="dxa" w:w="80"/>
-              <w:right w:type="dxa" w:w="100"/>
-            </w:tcMar>
-          </w:tcPr>
-          <w:p>
-            <w:r>
-              <w:rPr>
-                <w:b w:val="false"/>
-                <w:bCs w:val="false"/>
-                <w:sz w:val="19"/>
-                <w:szCs w:val="19"/>
-              </w:rPr>
-              <w:t xml:space="preserve">Un suspiro corto, sin gesto de derrota.</w:t>
-            </w:r>
-          </w:p>
-        </w:tc>
-        <w:tc>
-          <w:tcPr>
-            <w:tcW w:type="dxa" w:w="5000"/>
-            <w:tcMar>
-              <w:top w:type="dxa" w:w="80"/>
-              <w:left w:type="dxa" w:w="100"/>
-              <w:bottom w:type="dxa" w:w="80"/>
-              <w:right w:type="dxa" w:w="100"/>
-            </w:tcMar>
-          </w:tcPr>
-          <w:p>
-            <w:r>
-              <w:rPr>
-                <w:b w:val="false"/>
-                <w:bCs w:val="false"/>
-                <w:sz w:val="19"/>
-                <w:szCs w:val="19"/>
-              </w:rPr>
-              <w:t xml:space="preserve">“No te falta ser más rápida. Te falta un par de manos más.”</w:t>
-            </w:r>
-          </w:p>
-        </w:tc>
-      </w:tr>
-      <w:tr>
-        <w:tc>
-          <w:tcPr>
-            <w:tcW w:type="dxa" w:w="1100"/>
-            <w:tcMar>
-              <w:top w:type="dxa" w:w="80"/>
-              <w:left w:type="dxa" w:w="100"/>
-              <w:bottom w:type="dxa" w:w="80"/>
-              <w:right w:type="dxa" w:w="100"/>
-            </w:tcMar>
-          </w:tcPr>
-          <w:p>
-            <w:r>
-              <w:rPr>
-                <w:b w:val="false"/>
-                <w:bCs w:val="false"/>
-                <w:sz w:val="19"/>
-                <w:szCs w:val="19"/>
-              </w:rPr>
-              <w:t xml:space="preserve">16-19 s</w:t>
-            </w:r>
-          </w:p>
-        </w:tc>
-        <w:tc>
-          <w:tcPr>
-            <w:tcW w:type="dxa" w:w="4366"/>
-            <w:tcMar>
-              <w:top w:type="dxa" w:w="80"/>
-              <w:left w:type="dxa" w:w="100"/>
-              <w:bottom w:type="dxa" w:w="80"/>
-              <w:right w:type="dxa" w:w="100"/>
-            </w:tcMar>
-          </w:tcPr>
-          <w:p>
-            <w:r>
-              <w:rPr>
-                <w:b w:val="false"/>
-                <w:bCs w:val="false"/>
-                <w:sz w:val="19"/>
-                <w:szCs w:val="19"/>
-              </w:rPr>
-              <w:t xml:space="preserve">Cierre.</w:t>
-            </w:r>
-          </w:p>
-        </w:tc>
-        <w:tc>
-          <w:tcPr>
-            <w:tcW w:type="dxa" w:w="5000"/>
-            <w:tcMar>
-              <w:top w:type="dxa" w:w="80"/>
-              <w:left w:type="dxa" w:w="100"/>
-              <w:bottom w:type="dxa" w:w="80"/>
-              <w:right w:type="dxa" w:w="100"/>
-            </w:tcMar>
-          </w:tcPr>
-          <w:p>
-            <w:r>
-              <w:rPr>
-                <w:b w:val="false"/>
-                <w:bCs w:val="false"/>
-                <w:sz w:val="19"/>
-                <w:szCs w:val="19"/>
-              </w:rPr>
-              <w:t xml:space="preserve">CTA: “¿Cuántos mensajes sin contestar tienes ahorita? Cuéntanos en los comentarios.” + “Guarda este video para cuando te vuelva a pasar”. No pide WhatsApp ni nombra producto.</w:t>
+              <w:t xml:space="preserve">“Cinco minutos, dijo.” + CTA “¿Cuántos tienes ahorita sin contestar? 👇”. No pide WhatsApp ni nombra producto.</w:t>
             </w:r>
           </w:p>
         </w:tc>
       </w:tr>
     </w:tbl>
+    <w:p>
+      <w:pPr>
+        <w:pStyle w:val="Heading2"/>
+        <w:spacing w:after="150" w:before="300"/>
+      </w:pPr>
+      <w:r>
+        <w:t xml:space="preserve">Producción y estilo</w:t>
+      </w:r>
+    </w:p>
+    <w:p>
+      <w:pPr>
+        <w:pStyle w:val="ListParagraph"/>
+        <w:numPr>
+          <w:ilvl w:val="0"/>
+          <w:numId w:val="1"/>
+        </w:numPr>
+        <w:spacing w:after="80"/>
+      </w:pPr>
+      <w:r>
+        <w:t xml:space="preserve">Antes de grabar: ocultar otros chats con datos personales, activar “No molestar”, que no se vea el número del contacto y subir el brillo.</w:t>
+      </w:r>
+    </w:p>
+    <w:p>
+      <w:pPr>
+        <w:pStyle w:val="ListParagraph"/>
+        <w:numPr>
+          <w:ilvl w:val="0"/>
+          <w:numId w:val="1"/>
+        </w:numPr>
+        <w:spacing w:after="80"/>
+      </w:pPr>
+      <w:r>
+        <w:t xml:space="preserve">Toma principal (3 intentos): un segundo celular filma, por encima de la mano, el celular con el chat; cuarto en penumbra con lámpara cálida. Respaldo: grabación de pantalla del celular del CEO.</w:t>
+      </w:r>
+    </w:p>
+    <w:p>
+      <w:pPr>
+        <w:pStyle w:val="ListParagraph"/>
+        <w:numPr>
+          <w:ilvl w:val="0"/>
+          <w:numId w:val="1"/>
+        </w:numPr>
+        <w:spacing w:after="80"/>
+      </w:pPr>
+      <w:r>
+        <w:t xml:space="preserve">Edición en CapCut: textos quemados (es un video sin voz), “tin” por mensaje y silencio de medio segundo antes del remate.</w:t>
+      </w:r>
+    </w:p>
+    <w:p>
+      <w:pPr>
+        <w:pStyle w:val="ListParagraph"/>
+        <w:numPr>
+          <w:ilvl w:val="0"/>
+          <w:numId w:val="1"/>
+        </w:numPr>
+        <w:spacing w:after="80"/>
+      </w:pPr>
+      <w:r>
+        <w:t xml:space="preserve">Línea gráfica: texto blanco sobre caja negra; verde fosforescente solo en el marcador de “Cinco minutos después:” y el borde del CTA.</w:t>
+      </w:r>
+    </w:p>
+    <w:p>
+      <w:pPr>
+        <w:pStyle w:val="ListParagraph"/>
+        <w:numPr>
+          <w:ilvl w:val="0"/>
+          <w:numId w:val="1"/>
+        </w:numPr>
+        <w:spacing w:after="80"/>
+      </w:pPr>
+      <w:r>
+        <w:t xml:space="preserve">Portada: el frame del chat con “Ya no importa, gracias 🙏” en primer plano.</w:t>
+      </w:r>
+    </w:p>
+    <w:p>
+      <w:pPr>
+        <w:pStyle w:val="Heading3"/>
+        <w:spacing w:after="100" w:before="200"/>
+      </w:pPr>
+      <w:r>
+        <w:t xml:space="preserve">Caption (borrador)</w:t>
+      </w:r>
+    </w:p>
     <w:p>
       <w:pPr>
         <w:spacing w:after="120"/>
@@ -3471,7 +3728,25 @@
           <w:i w:val="false"/>
           <w:iCs w:val="false"/>
         </w:rPr>
+        <w:t xml:space="preserve">«Ya le contesto en 5 minutos». Cinco minutos después: “Ya no importa, gracias 🙏”. Cuéntanos en los comentarios: ¿cuántos mensajes tienes ahorita sin contestar? Guarda este reel para la próxima vez que se te pase “un ratito”.</w:t>
+      </w:r>
+    </w:p>
+    <w:p>
+      <w:pPr>
+        <w:pageBreakBefore/>
+      </w:pPr>
+      <w:r>
+        <w:br/>
         <w:t xml:space="preserve"/>
+      </w:r>
+    </w:p>
+    <w:p>
+      <w:pPr>
+        <w:pStyle w:val="Heading1"/>
+        <w:spacing w:after="200" w:before="400"/>
+      </w:pPr>
+      <w:r>
+        <w:t xml:space="preserve">Pieza 03 — Reel del CEO a cámara (≤ 22 s)</w:t>
       </w:r>
     </w:p>
     <w:p>
@@ -3485,7 +3760,7 @@
           <w:i/>
           <w:iCs/>
         </w:rPr>
-        <w:t xml:space="preserve">Por qué funciona: “Ya no importa, gracias” es una frase que cualquier dueña de negocio ya ha recibido, así que detona comentarios sin dramatizar ni vender.</w:t>
+        <w:t xml:space="preserve">Reel · 9:16 · ≤ 22 s (~62 palabras) · IG + Facebook · Awareness / confianza · Una sola toma · Publica: 16/10</w:t>
       </w:r>
     </w:p>
     <w:p>
@@ -3494,221 +3769,7 @@
         <w:spacing w:after="150" w:before="300"/>
       </w:pPr>
       <w:r>
-        <w:t xml:space="preserve">Producción y estilo</w:t>
-      </w:r>
-    </w:p>
-    <w:p>
-      <w:pPr>
-        <w:pStyle w:val="ListParagraph"/>
-        <w:numPr>
-          <w:ilvl w:val="0"/>
-          <w:numId w:val="1"/>
-        </w:numPr>
-        <w:spacing w:after="80"/>
-      </w:pPr>
-      <w:r>
-        <w:t xml:space="preserve">2 tomas: Toma 1 continua con trípode o soporte de pecho a la altura de los ojos de la “dueña”, mirando por encima del hombro de la “clienta” (~12-14 s); Toma 2 (insert) cenital al celular con pantalla bloqueada genérica (~4-5 s).</w:t>
-      </w:r>
-    </w:p>
-    <w:p>
-      <w:pPr>
-        <w:pStyle w:val="ListParagraph"/>
-        <w:numPr>
-          <w:ilvl w:val="0"/>
-          <w:numId w:val="1"/>
-        </w:numPr>
-        <w:spacing w:after="80"/>
-      </w:pPr>
-      <w:r>
-        <w:t xml:space="preserve">Se agrega en edición: hook, los 4 banners, el cierre y el CTA. Banners simulados con forma de notificación, en negro con texto blanco y detalle verde; sin logos ni nombres de contactos.</w:t>
-      </w:r>
-    </w:p>
-    <w:p>
-      <w:pPr>
-        <w:pStyle w:val="ListParagraph"/>
-        <w:numPr>
-          <w:ilvl w:val="0"/>
-          <w:numId w:val="1"/>
-        </w:numPr>
-        <w:spacing w:after="80"/>
-      </w:pPr>
-      <w:r>
-        <w:t xml:space="preserve">Línea gráfica: texto blanco sobre caja negra semitransparente; verde fosforescente solo en el banner final (borde) y el CTA. Subtítulos quemados obligatorios.</w:t>
-      </w:r>
-    </w:p>
-    <w:p>
-      <w:pPr>
-        <w:pStyle w:val="ListParagraph"/>
-        <w:numPr>
-          <w:ilvl w:val="0"/>
-          <w:numId w:val="1"/>
-        </w:numPr>
-        <w:spacing w:after="80"/>
-      </w:pPr>
-      <w:r>
-        <w:t xml:space="preserve">Portada: frame de la Toma 1 con el hook visible (manos + nuca de la clienta + celular encendido). Expresión de ocupada, no de pánico.</w:t>
-      </w:r>
-    </w:p>
-    <w:p>
-      <w:pPr>
-        <w:pStyle w:val="Heading3"/>
-        <w:spacing w:after="100" w:before="200"/>
-      </w:pPr>
-      <w:r>
-        <w:t xml:space="preserve">Caption (borrador)</w:t>
-      </w:r>
-    </w:p>
-    <w:p>
-      <w:pPr>
-        <w:spacing w:after="120"/>
-      </w:pPr>
-      <w:r>
-        <w:rPr>
-          <w:b w:val="false"/>
-          <w:bCs w:val="false"/>
-          <w:i w:val="false"/>
-          <w:iCs w:val="false"/>
-        </w:rPr>
-        <w:t xml:space="preserve">Son las 6pm, tienes clienta en la silla y el celular no para. Y cuando por fin lo miras: “Ya no importa, gracias”. No es que te falte organización: hacen falta más manos de las que tienes, y eso no se arregla con más disciplina. Cuéntanos: ¿cuántos mensajes sin contestar tienes ahorita mismo? Guarda este reel para la próxima vez que te pase.</w:t>
-      </w:r>
-    </w:p>
-    <w:p>
-      <w:pPr>
-        <w:pageBreakBefore/>
-      </w:pPr>
-      <w:r>
-        <w:br/>
-        <w:t xml:space="preserve"/>
-      </w:r>
-    </w:p>
-    <w:p>
-      <w:pPr>
-        <w:pStyle w:val="Heading1"/>
-        <w:spacing w:after="200" w:before="400"/>
-      </w:pPr>
-      <w:r>
-        <w:t xml:space="preserve">Pieza 03 — Reel del CEO a cámara</w:t>
-      </w:r>
-    </w:p>
-    <w:p>
-      <w:pPr>
-        <w:spacing w:after="120"/>
-      </w:pPr>
-      <w:r>
-        <w:rPr>
-          <w:b w:val="false"/>
-          <w:bCs w:val="false"/>
-          <w:i/>
-          <w:iCs/>
-        </w:rPr>
-        <w:t xml:space="preserve">Reel · 9:16 · ~50-58 s · IG + Facebook · Awareness / confianza · Una sola toma · Publica: 16/10</w:t>
-      </w:r>
-    </w:p>
-    <w:p>
-      <w:pPr>
-        <w:pStyle w:val="Heading2"/>
-        <w:spacing w:after="150" w:before="300"/>
-      </w:pPr>
-      <w:r>
-        <w:t xml:space="preserve">Hook</w:t>
-      </w:r>
-    </w:p>
-    <w:p>
-      <w:pPr>
-        <w:spacing w:after="120"/>
-      </w:pPr>
-      <w:r>
-        <w:rPr>
-          <w:b/>
-          <w:bCs/>
-          <w:i w:val="false"/>
-          <w:iCs w:val="false"/>
-        </w:rPr>
-        <w:t xml:space="preserve">“Voy a decir algo que casi nadie en este negocio quiere admitir: no estás perdiendo clientes porque cortas mal el pelo. Los estás perdiendo por WhatsApp.”</w:t>
-      </w:r>
-    </w:p>
-    <w:p>
-      <w:pPr>
-        <w:spacing w:after="120"/>
-      </w:pPr>
-      <w:r>
-        <w:rPr>
-          <w:b w:val="false"/>
-          <w:bCs w:val="false"/>
-          <w:i w:val="false"/>
-          <w:iCs w:val="false"/>
-        </w:rPr>
-        <w:t xml:space="preserve">Texto en pantalla: “No es tu trabajo. Es tu WhatsApp.”</w:t>
-      </w:r>
-    </w:p>
-    <w:p>
-      <w:pPr>
-        <w:pStyle w:val="Heading2"/>
-        <w:spacing w:after="150" w:before="300"/>
-      </w:pPr>
-      <w:r>
-        <w:t xml:space="preserve">Cómo se graba</w:t>
-      </w:r>
-    </w:p>
-    <w:p>
-      <w:pPr>
-        <w:pStyle w:val="ListParagraph"/>
-        <w:numPr>
-          <w:ilvl w:val="0"/>
-          <w:numId w:val="1"/>
-        </w:numPr>
-        <w:spacing w:after="80"/>
-      </w:pPr>
-      <w:r>
-        <w:t xml:space="preserve">Toma A obligatoria: una sola toma continua en oficina o casa, plano medio, trípode a la altura de los ojos. Si el CEO se traba, repite solo esa frase; se reemplaza en edición.</w:t>
-      </w:r>
-    </w:p>
-    <w:p>
-      <w:pPr>
-        <w:pStyle w:val="ListParagraph"/>
-        <w:numPr>
-          <w:ilvl w:val="0"/>
-          <w:numId w:val="1"/>
-        </w:numPr>
-        <w:spacing w:after="80"/>
-      </w:pPr>
-      <w:r>
-        <w:t xml:space="preserve">Toma B opcional: mismo lugar, plano más cerrado, solo el hook y el beat 5 (clímax), para cortar en edición.</w:t>
-      </w:r>
-    </w:p>
-    <w:p>
-      <w:pPr>
-        <w:pStyle w:val="ListParagraph"/>
-        <w:numPr>
-          <w:ilvl w:val="0"/>
-          <w:numId w:val="1"/>
-        </w:numPr>
-        <w:spacing w:after="80"/>
-      </w:pPr>
-      <w:r>
-        <w:t xml:space="preserve">La persona de marketing sostiene el celular con la guía justo debajo del lente (teleprompter casero) y avisa si se traba una frase.</w:t>
-      </w:r>
-    </w:p>
-    <w:p>
-      <w:pPr>
-        <w:pStyle w:val="ListParagraph"/>
-        <w:numPr>
-          <w:ilvl w:val="0"/>
-          <w:numId w:val="1"/>
-        </w:numPr>
-        <w:spacing w:after="80"/>
-      </w:pPr>
-      <w:r>
-        <w:t xml:space="preserve">Vestuario negro, blanco o neutro sin logos; fondo simple con textura real. Variación de encuadre con punch-in digital en edición.</w:t>
-      </w:r>
-    </w:p>
-    <w:p>
-      <w:pPr>
-        <w:pStyle w:val="Heading2"/>
-        <w:spacing w:after="150" w:before="300"/>
-      </w:pPr>
-      <w:r>
-        <w:t xml:space="preserve">Guion</w:t>
+        <w:t xml:space="preserve">Hooks (humor y curiosidad)</w:t>
       </w:r>
     </w:p>
     <w:tbl>
@@ -3724,14 +3785,14 @@
         </w:tblBorders>
       </w:tblPr>
       <w:tblGrid>
-        <w:gridCol w:w="1900"/>
-        <w:gridCol w:w="5366"/>
-        <w:gridCol w:w="3200"/>
+        <w:gridCol w:w="1700"/>
+        <w:gridCol w:w="7266"/>
+        <w:gridCol w:w="1500"/>
       </w:tblGrid>
       <w:tr>
         <w:tc>
           <w:tcPr>
-            <w:tcW w:type="dxa" w:w="1900"/>
+            <w:tcW w:type="dxa" w:w="1700"/>
             <w:shd w:fill="111111" w:val="clear"/>
             <w:tcMar>
               <w:top w:type="dxa" w:w="80"/>
@@ -3749,13 +3810,13 @@
                 <w:sz w:val="19"/>
                 <w:szCs w:val="19"/>
               </w:rPr>
-              <w:t xml:space="preserve">Beat</w:t>
-            </w:r>
-          </w:p>
-        </w:tc>
-        <w:tc>
-          <w:tcPr>
-            <w:tcW w:type="dxa" w:w="5366"/>
+              <w:t xml:space="preserve">#</w:t>
+            </w:r>
+          </w:p>
+        </w:tc>
+        <w:tc>
+          <w:tcPr>
+            <w:tcW w:type="dxa" w:w="7266"/>
             <w:shd w:fill="111111" w:val="clear"/>
             <w:tcMar>
               <w:top w:type="dxa" w:w="80"/>
@@ -3773,13 +3834,13 @@
                 <w:sz w:val="19"/>
                 <w:szCs w:val="19"/>
               </w:rPr>
-              <w:t xml:space="preserve">El CEO dice</w:t>
-            </w:r>
-          </w:p>
-        </w:tc>
-        <w:tc>
-          <w:tcPr>
-            <w:tcW w:type="dxa" w:w="3200"/>
+              <w:t xml:space="preserve">El CEO dice / texto en pantalla</w:t>
+            </w:r>
+          </w:p>
+        </w:tc>
+        <w:tc>
+          <w:tcPr>
+            <w:tcW w:type="dxa" w:w="1500"/>
             <w:shd w:fill="111111" w:val="clear"/>
             <w:tcMar>
               <w:top w:type="dxa" w:w="80"/>
@@ -3797,483 +3858,211 @@
                 <w:sz w:val="19"/>
                 <w:szCs w:val="19"/>
               </w:rPr>
-              <w:t xml:space="preserve">Texto en pantalla</w:t>
-            </w:r>
-          </w:p>
-        </w:tc>
-      </w:tr>
-      <w:tr>
-        <w:tc>
-          <w:tcPr>
-            <w:tcW w:type="dxa" w:w="1900"/>
-            <w:tcMar>
-              <w:top w:type="dxa" w:w="80"/>
-              <w:left w:type="dxa" w:w="100"/>
-              <w:bottom w:type="dxa" w:w="80"/>
-              <w:right w:type="dxa" w:w="100"/>
-            </w:tcMar>
-          </w:tcPr>
-          <w:p>
-            <w:r>
-              <w:rPr>
-                <w:b w:val="false"/>
-                <w:bCs w:val="false"/>
-                <w:sz w:val="19"/>
-                <w:szCs w:val="19"/>
-              </w:rPr>
-              <w:t xml:space="preserve">1 — Quién habla (3-7 s)</w:t>
-            </w:r>
-          </w:p>
-        </w:tc>
-        <w:tc>
-          <w:tcPr>
-            <w:tcW w:type="dxa" w:w="5366"/>
-            <w:tcMar>
-              <w:top w:type="dxa" w:w="80"/>
-              <w:left w:type="dxa" w:w="100"/>
-              <w:bottom w:type="dxa" w:w="80"/>
-              <w:right w:type="dxa" w:w="100"/>
-            </w:tcMar>
-          </w:tcPr>
-          <w:p>
-            <w:r>
-              <w:rPr>
-                <w:b w:val="false"/>
-                <w:bCs w:val="false"/>
-                <w:sz w:val="19"/>
-                <w:szCs w:val="19"/>
-              </w:rPr>
-              <w:t xml:space="preserve">“Soy [nombre], estamos empezando a construir una herramienta para negocios de servicios en Ecuador. Y antes de hablar de ninguna herramienta, quiero decir esto claro.”</w:t>
-            </w:r>
-          </w:p>
-        </w:tc>
-        <w:tc>
-          <w:tcPr>
-            <w:tcW w:type="dxa" w:w="3200"/>
-            <w:tcMar>
-              <w:top w:type="dxa" w:w="80"/>
-              <w:left w:type="dxa" w:w="100"/>
-              <w:bottom w:type="dxa" w:w="80"/>
-              <w:right w:type="dxa" w:w="100"/>
-            </w:tcMar>
-          </w:tcPr>
-          <w:p>
-            <w:r>
-              <w:rPr>
-                <w:b w:val="false"/>
-                <w:bCs w:val="false"/>
-                <w:sz w:val="19"/>
-                <w:szCs w:val="19"/>
-              </w:rPr>
-              <w:t xml:space="preserve">[Nombre] · Fundador de Iguana · Estamos empezando</w:t>
-            </w:r>
-          </w:p>
-        </w:tc>
-      </w:tr>
-      <w:tr>
-        <w:tc>
-          <w:tcPr>
-            <w:tcW w:type="dxa" w:w="1900"/>
-            <w:tcMar>
-              <w:top w:type="dxa" w:w="80"/>
-              <w:left w:type="dxa" w:w="100"/>
-              <w:bottom w:type="dxa" w:w="80"/>
-              <w:right w:type="dxa" w:w="100"/>
-            </w:tcMar>
-          </w:tcPr>
-          <w:p>
-            <w:r>
-              <w:rPr>
-                <w:b w:val="false"/>
-                <w:bCs w:val="false"/>
-                <w:sz w:val="19"/>
-                <w:szCs w:val="19"/>
-              </w:rPr>
-              <w:t xml:space="preserve">2 — El dato (7-14 s)</w:t>
-            </w:r>
-          </w:p>
-        </w:tc>
-        <w:tc>
-          <w:tcPr>
-            <w:tcW w:type="dxa" w:w="5366"/>
-            <w:tcMar>
-              <w:top w:type="dxa" w:w="80"/>
-              <w:left w:type="dxa" w:w="100"/>
-              <w:bottom w:type="dxa" w:w="80"/>
-              <w:right w:type="dxa" w:w="100"/>
-            </w:tcMar>
-          </w:tcPr>
-          <w:p>
-            <w:r>
-              <w:rPr>
-                <w:b w:val="false"/>
-                <w:bCs w:val="false"/>
-                <w:sz w:val="19"/>
-                <w:szCs w:val="19"/>
-              </w:rPr>
-              <w:t xml:space="preserve">“Un análisis del sector sobre salones en Latinoamérica calcula que pierden entre 2 y 5 citas por semana. No por mal servicio: por mensajes de WhatsApp que nadie alcanzó a contestar a tiempo.”</w:t>
-            </w:r>
-          </w:p>
-        </w:tc>
-        <w:tc>
-          <w:tcPr>
-            <w:tcW w:type="dxa" w:w="3200"/>
-            <w:tcMar>
-              <w:top w:type="dxa" w:w="80"/>
-              <w:left w:type="dxa" w:w="100"/>
-              <w:bottom w:type="dxa" w:w="80"/>
-              <w:right w:type="dxa" w:w="100"/>
-            </w:tcMar>
-          </w:tcPr>
-          <w:p>
-            <w:r>
-              <w:rPr>
-                <w:b w:val="false"/>
-                <w:bCs w:val="false"/>
-                <w:sz w:val="19"/>
-                <w:szCs w:val="19"/>
-              </w:rPr>
-              <w:t xml:space="preserve">2–5 citas perdidas / semana (salones en Latinoamérica, análisis del sector)</w:t>
-            </w:r>
-          </w:p>
-        </w:tc>
-      </w:tr>
-      <w:tr>
-        <w:tc>
-          <w:tcPr>
-            <w:tcW w:type="dxa" w:w="1900"/>
-            <w:tcMar>
-              <w:top w:type="dxa" w:w="80"/>
-              <w:left w:type="dxa" w:w="100"/>
-              <w:bottom w:type="dxa" w:w="80"/>
-              <w:right w:type="dxa" w:w="100"/>
-            </w:tcMar>
-          </w:tcPr>
-          <w:p>
-            <w:r>
-              <w:rPr>
-                <w:b w:val="false"/>
-                <w:bCs w:val="false"/>
-                <w:sz w:val="19"/>
-                <w:szCs w:val="19"/>
-              </w:rPr>
-              <w:t xml:space="preserve">3 — La escena (14-22 s)</w:t>
-            </w:r>
-          </w:p>
-        </w:tc>
-        <w:tc>
-          <w:tcPr>
-            <w:tcW w:type="dxa" w:w="5366"/>
-            <w:tcMar>
-              <w:top w:type="dxa" w:w="80"/>
-              <w:left w:type="dxa" w:w="100"/>
-              <w:bottom w:type="dxa" w:w="80"/>
-              <w:right w:type="dxa" w:w="100"/>
-            </w:tcMar>
-          </w:tcPr>
-          <w:p>
-            <w:r>
-              <w:rPr>
-                <w:b w:val="false"/>
-                <w:bCs w:val="false"/>
-                <w:sz w:val="19"/>
-                <w:szCs w:val="19"/>
-              </w:rPr>
-              <w:t xml:space="preserve">“Piensa en alguien cortando el pelo de una clienta a las 6 de la tarde. Le entra un WhatsApp... No lo puede ver. Cuando contesta, dos horas después, esa persona ya agendó en otro lado.”</w:t>
-            </w:r>
-          </w:p>
-        </w:tc>
-        <w:tc>
-          <w:tcPr>
-            <w:tcW w:type="dxa" w:w="3200"/>
-            <w:tcMar>
-              <w:top w:type="dxa" w:w="80"/>
-              <w:left w:type="dxa" w:w="100"/>
-              <w:bottom w:type="dxa" w:w="80"/>
-              <w:right w:type="dxa" w:w="100"/>
-            </w:tcMar>
-          </w:tcPr>
-          <w:p>
-            <w:r>
-              <w:rPr>
-                <w:b w:val="false"/>
-                <w:bCs w:val="false"/>
-                <w:sz w:val="19"/>
-                <w:szCs w:val="19"/>
-              </w:rPr>
-              <w:t xml:space="preserve">6pm. Cliente al frente. WhatsApp esperando.</w:t>
-            </w:r>
-          </w:p>
-        </w:tc>
-      </w:tr>
-      <w:tr>
-        <w:tc>
-          <w:tcPr>
-            <w:tcW w:type="dxa" w:w="1900"/>
-            <w:tcMar>
-              <w:top w:type="dxa" w:w="80"/>
-              <w:left w:type="dxa" w:w="100"/>
-              <w:bottom w:type="dxa" w:w="80"/>
-              <w:right w:type="dxa" w:w="100"/>
-            </w:tcMar>
-          </w:tcPr>
-          <w:p>
-            <w:r>
-              <w:rPr>
-                <w:b w:val="false"/>
-                <w:bCs w:val="false"/>
-                <w:sz w:val="19"/>
-                <w:szCs w:val="19"/>
-              </w:rPr>
-              <w:t xml:space="preserve">4 — El costo (22-30 s)</w:t>
-            </w:r>
-          </w:p>
-        </w:tc>
-        <w:tc>
-          <w:tcPr>
-            <w:tcW w:type="dxa" w:w="5366"/>
-            <w:tcMar>
-              <w:top w:type="dxa" w:w="80"/>
-              <w:left w:type="dxa" w:w="100"/>
-              <w:bottom w:type="dxa" w:w="80"/>
-              <w:right w:type="dxa" w:w="100"/>
-            </w:tcMar>
-          </w:tcPr>
-          <w:p>
-            <w:r>
-              <w:rPr>
-                <w:b w:val="false"/>
-                <w:bCs w:val="false"/>
-                <w:sz w:val="19"/>
-                <w:szCs w:val="19"/>
-              </w:rPr>
-              <w:t xml:space="preserve">“No se siente como ‘perdí una cita’. Se siente como trabajar todo el día y no saber bien por qué a fin de mes no alcanza. Eso no es falta de talento. Es un problema de tiempo.”</w:t>
-            </w:r>
-          </w:p>
-        </w:tc>
-        <w:tc>
-          <w:tcPr>
-            <w:tcW w:type="dxa" w:w="3200"/>
-            <w:tcMar>
-              <w:top w:type="dxa" w:w="80"/>
-              <w:left w:type="dxa" w:w="100"/>
-              <w:bottom w:type="dxa" w:w="80"/>
-              <w:right w:type="dxa" w:w="100"/>
-            </w:tcMar>
-          </w:tcPr>
-          <w:p>
-            <w:r>
-              <w:rPr>
-                <w:b w:val="false"/>
-                <w:bCs w:val="false"/>
-                <w:sz w:val="19"/>
-                <w:szCs w:val="19"/>
-              </w:rPr>
-              <w:t xml:space="preserve">No es falta de talento. Es falta de tiempo.</w:t>
-            </w:r>
-          </w:p>
-        </w:tc>
-      </w:tr>
-      <w:tr>
-        <w:tc>
-          <w:tcPr>
-            <w:tcW w:type="dxa" w:w="1900"/>
-            <w:tcMar>
-              <w:top w:type="dxa" w:w="80"/>
-              <w:left w:type="dxa" w:w="100"/>
-              <w:bottom w:type="dxa" w:w="80"/>
-              <w:right w:type="dxa" w:w="100"/>
-            </w:tcMar>
-          </w:tcPr>
-          <w:p>
-            <w:r>
-              <w:rPr>
-                <w:b w:val="false"/>
-                <w:bCs w:val="false"/>
-                <w:sz w:val="19"/>
-                <w:szCs w:val="19"/>
-              </w:rPr>
-              <w:t xml:space="preserve">5 — Clímax (30-38 s)</w:t>
-            </w:r>
-          </w:p>
-        </w:tc>
-        <w:tc>
-          <w:tcPr>
-            <w:tcW w:type="dxa" w:w="5366"/>
-            <w:tcMar>
-              <w:top w:type="dxa" w:w="80"/>
-              <w:left w:type="dxa" w:w="100"/>
-              <w:bottom w:type="dxa" w:w="80"/>
-              <w:right w:type="dxa" w:w="100"/>
-            </w:tcMar>
-          </w:tcPr>
-          <w:p>
-            <w:r>
-              <w:rPr>
-                <w:b w:val="false"/>
-                <w:bCs w:val="false"/>
-                <w:sz w:val="19"/>
-                <w:szCs w:val="19"/>
-              </w:rPr>
-              <w:t xml:space="preserve">“Le pedimos a una sola persona que atienda al cliente que tiene enfrente y que esté disponible en WhatsApp todo el día, como si fuera un negocio con cinco empleados. No es un problema de disciplina. Es un problema de diseño.”</w:t>
-            </w:r>
-          </w:p>
-        </w:tc>
-        <w:tc>
-          <w:tcPr>
-            <w:tcW w:type="dxa" w:w="3200"/>
-            <w:tcMar>
-              <w:top w:type="dxa" w:w="80"/>
-              <w:left w:type="dxa" w:w="100"/>
-              <w:bottom w:type="dxa" w:w="80"/>
-              <w:right w:type="dxa" w:w="100"/>
-            </w:tcMar>
-          </w:tcPr>
-          <w:p>
-            <w:r>
-              <w:rPr>
-                <w:b w:val="false"/>
-                <w:bCs w:val="false"/>
-                <w:sz w:val="19"/>
-                <w:szCs w:val="19"/>
-              </w:rPr>
-              <w:t xml:space="preserve">No es falta de disciplina. Es falta de diseño.</w:t>
-            </w:r>
-          </w:p>
-        </w:tc>
-      </w:tr>
-      <w:tr>
-        <w:tc>
-          <w:tcPr>
-            <w:tcW w:type="dxa" w:w="1900"/>
-            <w:tcMar>
-              <w:top w:type="dxa" w:w="80"/>
-              <w:left w:type="dxa" w:w="100"/>
-              <w:bottom w:type="dxa" w:w="80"/>
-              <w:right w:type="dxa" w:w="100"/>
-            </w:tcMar>
-          </w:tcPr>
-          <w:p>
-            <w:r>
-              <w:rPr>
-                <w:b w:val="false"/>
-                <w:bCs w:val="false"/>
-                <w:sz w:val="19"/>
-                <w:szCs w:val="19"/>
-              </w:rPr>
-              <w:t xml:space="preserve">6 — Apertura (38-45 s)</w:t>
-            </w:r>
-          </w:p>
-        </w:tc>
-        <w:tc>
-          <w:tcPr>
-            <w:tcW w:type="dxa" w:w="5366"/>
-            <w:tcMar>
-              <w:top w:type="dxa" w:w="80"/>
-              <w:left w:type="dxa" w:w="100"/>
-              <w:bottom w:type="dxa" w:w="80"/>
-              <w:right w:type="dxa" w:w="100"/>
-            </w:tcMar>
-          </w:tcPr>
-          <w:p>
-            <w:r>
-              <w:rPr>
-                <w:b w:val="false"/>
-                <w:bCs w:val="false"/>
-                <w:sz w:val="19"/>
-                <w:szCs w:val="19"/>
-              </w:rPr>
-              <w:t xml:space="preserve">“La buena noticia es que esto sí se puede resolver, sin que tengas que vivir pegada al celular. De eso voy a hablar en los próximos días.”</w:t>
-            </w:r>
-          </w:p>
-        </w:tc>
-        <w:tc>
-          <w:tcPr>
-            <w:tcW w:type="dxa" w:w="3200"/>
-            <w:tcMar>
-              <w:top w:type="dxa" w:w="80"/>
-              <w:left w:type="dxa" w:w="100"/>
-              <w:bottom w:type="dxa" w:w="80"/>
-              <w:right w:type="dxa" w:w="100"/>
-            </w:tcMar>
-          </w:tcPr>
-          <w:p>
-            <w:r>
-              <w:rPr>
-                <w:b w:val="false"/>
-                <w:bCs w:val="false"/>
-                <w:sz w:val="19"/>
-                <w:szCs w:val="19"/>
-              </w:rPr>
-              <w:t xml:space="preserve">Esto se puede resolver. Sigue en la cuenta.</w:t>
-            </w:r>
-          </w:p>
-        </w:tc>
-      </w:tr>
-      <w:tr>
-        <w:tc>
-          <w:tcPr>
-            <w:tcW w:type="dxa" w:w="1900"/>
-            <w:tcMar>
-              <w:top w:type="dxa" w:w="80"/>
-              <w:left w:type="dxa" w:w="100"/>
-              <w:bottom w:type="dxa" w:w="80"/>
-              <w:right w:type="dxa" w:w="100"/>
-            </w:tcMar>
-          </w:tcPr>
-          <w:p>
-            <w:r>
-              <w:rPr>
-                <w:b w:val="false"/>
-                <w:bCs w:val="false"/>
-                <w:sz w:val="19"/>
-                <w:szCs w:val="19"/>
-              </w:rPr>
-              <w:t xml:space="preserve">CTA (7-8 s)</w:t>
-            </w:r>
-          </w:p>
-        </w:tc>
-        <w:tc>
-          <w:tcPr>
-            <w:tcW w:type="dxa" w:w="5366"/>
-            <w:tcMar>
-              <w:top w:type="dxa" w:w="80"/>
-              <w:left w:type="dxa" w:w="100"/>
-              <w:bottom w:type="dxa" w:w="80"/>
-              <w:right w:type="dxa" w:w="100"/>
-            </w:tcMar>
-          </w:tcPr>
-          <w:p>
-            <w:r>
-              <w:rPr>
-                <w:b w:val="false"/>
-                <w:bCs w:val="false"/>
-                <w:sz w:val="19"/>
-                <w:szCs w:val="19"/>
-              </w:rPr>
-              <w:t xml:space="preserve">“Si esto te suena parecido a tu negocio, cuéntame en los comentarios cuántas citas crees que se te escapan a la semana. Y sígueme si quieres ver cómo se resuelve.”</w:t>
-            </w:r>
-          </w:p>
-        </w:tc>
-        <w:tc>
-          <w:tcPr>
-            <w:tcW w:type="dxa" w:w="3200"/>
-            <w:tcMar>
-              <w:top w:type="dxa" w:w="80"/>
-              <w:left w:type="dxa" w:w="100"/>
-              <w:bottom w:type="dxa" w:w="80"/>
-              <w:right w:type="dxa" w:w="100"/>
-            </w:tcMar>
-          </w:tcPr>
-          <w:p>
-            <w:r>
-              <w:rPr>
-                <w:b w:val="false"/>
-                <w:bCs w:val="false"/>
-                <w:sz w:val="19"/>
-                <w:szCs w:val="19"/>
-              </w:rPr>
-              <w:t xml:space="preserve">¿Cuántas citas crees que pierdes a la semana? Cuéntame abajo · Sígueme</w:t>
+              <w:t xml:space="preserve">Estilo</w:t>
+            </w:r>
+          </w:p>
+        </w:tc>
+      </w:tr>
+      <w:tr>
+        <w:tc>
+          <w:tcPr>
+            <w:tcW w:type="dxa" w:w="1700"/>
+            <w:tcMar>
+              <w:top w:type="dxa" w:w="80"/>
+              <w:left w:type="dxa" w:w="100"/>
+              <w:bottom w:type="dxa" w:w="80"/>
+              <w:right w:type="dxa" w:w="100"/>
+            </w:tcMar>
+          </w:tcPr>
+          <w:p>
+            <w:r>
+              <w:rPr>
+                <w:b w:val="false"/>
+                <w:bCs w:val="false"/>
+                <w:sz w:val="19"/>
+                <w:szCs w:val="19"/>
+              </w:rPr>
+              <w:t xml:space="preserve">1 (recomendado)</w:t>
+            </w:r>
+          </w:p>
+        </w:tc>
+        <w:tc>
+          <w:tcPr>
+            <w:tcW w:type="dxa" w:w="7266"/>
+            <w:tcMar>
+              <w:top w:type="dxa" w:w="80"/>
+              <w:left w:type="dxa" w:w="100"/>
+              <w:bottom w:type="dxa" w:w="80"/>
+              <w:right w:type="dxa" w:w="100"/>
+            </w:tcMar>
+          </w:tcPr>
+          <w:p>
+            <w:r>
+              <w:rPr>
+                <w:b w:val="false"/>
+                <w:bCs w:val="false"/>
+                <w:sz w:val="19"/>
+                <w:szCs w:val="19"/>
+              </w:rPr>
+              <w:t xml:space="preserve">“Las dueñas de peluquería tienen un segundo trabajo que nadie les paga.” Texto: “El segundo trabajo que nadie les paga”.</w:t>
+            </w:r>
+          </w:p>
+        </w:tc>
+        <w:tc>
+          <w:tcPr>
+            <w:tcW w:type="dxa" w:w="1500"/>
+            <w:tcMar>
+              <w:top w:type="dxa" w:w="80"/>
+              <w:left w:type="dxa" w:w="100"/>
+              <w:bottom w:type="dxa" w:w="80"/>
+              <w:right w:type="dxa" w:w="100"/>
+            </w:tcMar>
+          </w:tcPr>
+          <w:p>
+            <w:r>
+              <w:rPr>
+                <w:b w:val="false"/>
+                <w:bCs w:val="false"/>
+                <w:sz w:val="19"/>
+                <w:szCs w:val="19"/>
+              </w:rPr>
+              <w:t xml:space="preserve">Curiosidad</w:t>
+            </w:r>
+          </w:p>
+        </w:tc>
+      </w:tr>
+      <w:tr>
+        <w:tc>
+          <w:tcPr>
+            <w:tcW w:type="dxa" w:w="1700"/>
+            <w:tcMar>
+              <w:top w:type="dxa" w:w="80"/>
+              <w:left w:type="dxa" w:w="100"/>
+              <w:bottom w:type="dxa" w:w="80"/>
+              <w:right w:type="dxa" w:w="100"/>
+            </w:tcMar>
+          </w:tcPr>
+          <w:p>
+            <w:r>
+              <w:rPr>
+                <w:b w:val="false"/>
+                <w:bCs w:val="false"/>
+                <w:sz w:val="19"/>
+                <w:szCs w:val="19"/>
+              </w:rPr>
+              <w:t xml:space="preserve">2</w:t>
+            </w:r>
+          </w:p>
+        </w:tc>
+        <w:tc>
+          <w:tcPr>
+            <w:tcW w:type="dxa" w:w="7266"/>
+            <w:tcMar>
+              <w:top w:type="dxa" w:w="80"/>
+              <w:left w:type="dxa" w:w="100"/>
+              <w:bottom w:type="dxa" w:w="80"/>
+              <w:right w:type="dxa" w:w="100"/>
+            </w:tcMar>
+          </w:tcPr>
+          <w:p>
+            <w:r>
+              <w:rPr>
+                <w:b w:val="false"/>
+                <w:bCs w:val="false"/>
+                <w:sz w:val="19"/>
+                <w:szCs w:val="19"/>
+              </w:rPr>
+              <w:t xml:space="preserve">“Cortar pelo y contestar WhatsApp a la vez no es multitarea. Es deporte extremo.”</w:t>
+            </w:r>
+          </w:p>
+        </w:tc>
+        <w:tc>
+          <w:tcPr>
+            <w:tcW w:type="dxa" w:w="1500"/>
+            <w:tcMar>
+              <w:top w:type="dxa" w:w="80"/>
+              <w:left w:type="dxa" w:w="100"/>
+              <w:bottom w:type="dxa" w:w="80"/>
+              <w:right w:type="dxa" w:w="100"/>
+            </w:tcMar>
+          </w:tcPr>
+          <w:p>
+            <w:r>
+              <w:rPr>
+                <w:b w:val="false"/>
+                <w:bCs w:val="false"/>
+                <w:sz w:val="19"/>
+                <w:szCs w:val="19"/>
+              </w:rPr>
+              <w:t xml:space="preserve">Humor</w:t>
+            </w:r>
+          </w:p>
+        </w:tc>
+      </w:tr>
+      <w:tr>
+        <w:tc>
+          <w:tcPr>
+            <w:tcW w:type="dxa" w:w="1700"/>
+            <w:tcMar>
+              <w:top w:type="dxa" w:w="80"/>
+              <w:left w:type="dxa" w:w="100"/>
+              <w:bottom w:type="dxa" w:w="80"/>
+              <w:right w:type="dxa" w:w="100"/>
+            </w:tcMar>
+          </w:tcPr>
+          <w:p>
+            <w:r>
+              <w:rPr>
+                <w:b w:val="false"/>
+                <w:bCs w:val="false"/>
+                <w:sz w:val="19"/>
+                <w:szCs w:val="19"/>
+              </w:rPr>
+              <w:t xml:space="preserve">3</w:t>
+            </w:r>
+          </w:p>
+        </w:tc>
+        <w:tc>
+          <w:tcPr>
+            <w:tcW w:type="dxa" w:w="7266"/>
+            <w:tcMar>
+              <w:top w:type="dxa" w:w="80"/>
+              <w:left w:type="dxa" w:w="100"/>
+              <w:bottom w:type="dxa" w:w="80"/>
+              <w:right w:type="dxa" w:w="100"/>
+            </w:tcMar>
+          </w:tcPr>
+          <w:p>
+            <w:r>
+              <w:rPr>
+                <w:b w:val="false"/>
+                <w:bCs w:val="false"/>
+                <w:sz w:val="19"/>
+                <w:szCs w:val="19"/>
+              </w:rPr>
+              <w:t xml:space="preserve">“Nadie te dijo que ser dueña de una peluquería incluye ser recepcionista.”</w:t>
+            </w:r>
+          </w:p>
+        </w:tc>
+        <w:tc>
+          <w:tcPr>
+            <w:tcW w:type="dxa" w:w="1500"/>
+            <w:tcMar>
+              <w:top w:type="dxa" w:w="80"/>
+              <w:left w:type="dxa" w:w="100"/>
+              <w:bottom w:type="dxa" w:w="80"/>
+              <w:right w:type="dxa" w:w="100"/>
+            </w:tcMar>
+          </w:tcPr>
+          <w:p>
+            <w:r>
+              <w:rPr>
+                <w:b w:val="false"/>
+                <w:bCs w:val="false"/>
+                <w:sz w:val="19"/>
+                <w:szCs w:val="19"/>
+              </w:rPr>
+              <w:t xml:space="preserve">Curiosidad</w:t>
             </w:r>
           </w:p>
         </w:tc>
@@ -4304,7 +4093,7 @@
           <w:i/>
           <w:iCs/>
         </w:rPr>
-        <w:t xml:space="preserve">Cuidado de honestidad: el guion no afirma experiencia ni contactos que el equipo no pueda respaldar (aún no hay clientes). El dato de las citas perdidas viene de un artículo de Pronto citado en el research: citarlo con su alcance real (salones de Latinoamérica), no como cifra propia ni de Ecuador, y verificar la fuente antes de publicar.</w:t>
+        <w:t xml:space="preserve">Por qué el hook 1: abre una pregunta (“¿cuál?”) que se contesta en el segundo siguiente y presenta a la dueña como alguien que trabaja de más, no como alguien que falla.</w:t>
       </w:r>
     </w:p>
     <w:p>
@@ -4313,7 +4102,408 @@
         <w:spacing w:after="150" w:before="300"/>
       </w:pPr>
       <w:r>
-        <w:t xml:space="preserve">Estilo, portada y checklist</w:t>
+        <w:t xml:space="preserve">Guion (una sola idea)</w:t>
+      </w:r>
+    </w:p>
+    <w:tbl>
+      <w:tblPr>
+        <w:tblW w:type="dxa" w:w="10466"/>
+        <w:tblBorders>
+          <w:top w:val="single" w:color="auto" w:sz="4"/>
+          <w:left w:val="single" w:color="auto" w:sz="4"/>
+          <w:bottom w:val="single" w:color="auto" w:sz="4"/>
+          <w:right w:val="single" w:color="auto" w:sz="4"/>
+          <w:insideH w:val="single" w:color="auto" w:sz="4"/>
+          <w:insideV w:val="single" w:color="auto" w:sz="4"/>
+        </w:tblBorders>
+      </w:tblPr>
+      <w:tblGrid>
+        <w:gridCol w:w="1100"/>
+        <w:gridCol w:w="5666"/>
+        <w:gridCol w:w="3700"/>
+      </w:tblGrid>
+      <w:tr>
+        <w:tc>
+          <w:tcPr>
+            <w:tcW w:type="dxa" w:w="1100"/>
+            <w:shd w:fill="111111" w:val="clear"/>
+            <w:tcMar>
+              <w:top w:type="dxa" w:w="80"/>
+              <w:left w:type="dxa" w:w="100"/>
+              <w:bottom w:type="dxa" w:w="80"/>
+              <w:right w:type="dxa" w:w="100"/>
+            </w:tcMar>
+          </w:tcPr>
+          <w:p>
+            <w:r>
+              <w:rPr>
+                <w:b/>
+                <w:bCs/>
+                <w:color w:val="39FF14"/>
+                <w:sz w:val="19"/>
+                <w:szCs w:val="19"/>
+              </w:rPr>
+              <w:t xml:space="preserve">Tiempo</w:t>
+            </w:r>
+          </w:p>
+        </w:tc>
+        <w:tc>
+          <w:tcPr>
+            <w:tcW w:type="dxa" w:w="5666"/>
+            <w:shd w:fill="111111" w:val="clear"/>
+            <w:tcMar>
+              <w:top w:type="dxa" w:w="80"/>
+              <w:left w:type="dxa" w:w="100"/>
+              <w:bottom w:type="dxa" w:w="80"/>
+              <w:right w:type="dxa" w:w="100"/>
+            </w:tcMar>
+          </w:tcPr>
+          <w:p>
+            <w:r>
+              <w:rPr>
+                <w:b/>
+                <w:bCs/>
+                <w:color w:val="39FF14"/>
+                <w:sz w:val="19"/>
+                <w:szCs w:val="19"/>
+              </w:rPr>
+              <w:t xml:space="preserve">El CEO dice</w:t>
+            </w:r>
+          </w:p>
+        </w:tc>
+        <w:tc>
+          <w:tcPr>
+            <w:tcW w:type="dxa" w:w="3700"/>
+            <w:shd w:fill="111111" w:val="clear"/>
+            <w:tcMar>
+              <w:top w:type="dxa" w:w="80"/>
+              <w:left w:type="dxa" w:w="100"/>
+              <w:bottom w:type="dxa" w:w="80"/>
+              <w:right w:type="dxa" w:w="100"/>
+            </w:tcMar>
+          </w:tcPr>
+          <w:p>
+            <w:r>
+              <w:rPr>
+                <w:b/>
+                <w:bCs/>
+                <w:color w:val="39FF14"/>
+                <w:sz w:val="19"/>
+                <w:szCs w:val="19"/>
+              </w:rPr>
+              <w:t xml:space="preserve">Texto en pantalla</w:t>
+            </w:r>
+          </w:p>
+        </w:tc>
+      </w:tr>
+      <w:tr>
+        <w:tc>
+          <w:tcPr>
+            <w:tcW w:type="dxa" w:w="1100"/>
+            <w:tcMar>
+              <w:top w:type="dxa" w:w="80"/>
+              <w:left w:type="dxa" w:w="100"/>
+              <w:bottom w:type="dxa" w:w="80"/>
+              <w:right w:type="dxa" w:w="100"/>
+            </w:tcMar>
+          </w:tcPr>
+          <w:p>
+            <w:r>
+              <w:rPr>
+                <w:b w:val="false"/>
+                <w:bCs w:val="false"/>
+                <w:sz w:val="19"/>
+                <w:szCs w:val="19"/>
+              </w:rPr>
+              <w:t xml:space="preserve">0-4 s</w:t>
+            </w:r>
+          </w:p>
+        </w:tc>
+        <w:tc>
+          <w:tcPr>
+            <w:tcW w:type="dxa" w:w="5666"/>
+            <w:tcMar>
+              <w:top w:type="dxa" w:w="80"/>
+              <w:left w:type="dxa" w:w="100"/>
+              <w:bottom w:type="dxa" w:w="80"/>
+              <w:right w:type="dxa" w:w="100"/>
+            </w:tcMar>
+          </w:tcPr>
+          <w:p>
+            <w:r>
+              <w:rPr>
+                <w:b w:val="false"/>
+                <w:bCs w:val="false"/>
+                <w:sz w:val="19"/>
+                <w:szCs w:val="19"/>
+              </w:rPr>
+              <w:t xml:space="preserve">“Las dueñas de peluquería tienen un segundo trabajo que nadie les paga.”</w:t>
+            </w:r>
+          </w:p>
+        </w:tc>
+        <w:tc>
+          <w:tcPr>
+            <w:tcW w:type="dxa" w:w="3700"/>
+            <w:tcMar>
+              <w:top w:type="dxa" w:w="80"/>
+              <w:left w:type="dxa" w:w="100"/>
+              <w:bottom w:type="dxa" w:w="80"/>
+              <w:right w:type="dxa" w:w="100"/>
+            </w:tcMar>
+          </w:tcPr>
+          <w:p>
+            <w:r>
+              <w:rPr>
+                <w:b w:val="false"/>
+                <w:bCs w:val="false"/>
+                <w:sz w:val="19"/>
+                <w:szCs w:val="19"/>
+              </w:rPr>
+              <w:t xml:space="preserve">El segundo trabajo que nadie les paga · rótulo “[Nombre] · Fundador de Iguana” (3 s)</w:t>
+            </w:r>
+          </w:p>
+        </w:tc>
+      </w:tr>
+      <w:tr>
+        <w:tc>
+          <w:tcPr>
+            <w:tcW w:type="dxa" w:w="1100"/>
+            <w:tcMar>
+              <w:top w:type="dxa" w:w="80"/>
+              <w:left w:type="dxa" w:w="100"/>
+              <w:bottom w:type="dxa" w:w="80"/>
+              <w:right w:type="dxa" w:w="100"/>
+            </w:tcMar>
+          </w:tcPr>
+          <w:p>
+            <w:r>
+              <w:rPr>
+                <w:b w:val="false"/>
+                <w:bCs w:val="false"/>
+                <w:sz w:val="19"/>
+                <w:szCs w:val="19"/>
+              </w:rPr>
+              <w:t xml:space="preserve">4-13 s</w:t>
+            </w:r>
+          </w:p>
+        </w:tc>
+        <w:tc>
+          <w:tcPr>
+            <w:tcW w:type="dxa" w:w="5666"/>
+            <w:tcMar>
+              <w:top w:type="dxa" w:w="80"/>
+              <w:left w:type="dxa" w:w="100"/>
+              <w:bottom w:type="dxa" w:w="80"/>
+              <w:right w:type="dxa" w:w="100"/>
+            </w:tcMar>
+          </w:tcPr>
+          <w:p>
+            <w:r>
+              <w:rPr>
+                <w:b w:val="false"/>
+                <w:bCs w:val="false"/>
+                <w:sz w:val="19"/>
+                <w:szCs w:val="19"/>
+              </w:rPr>
+              <w:t xml:space="preserve">“Ser recepcionistas. Cortan pelo con una mano y contestan WhatsApp con la otra. Y cuando no alcanzan, el cliente se va con otro.”</w:t>
+            </w:r>
+          </w:p>
+        </w:tc>
+        <w:tc>
+          <w:tcPr>
+            <w:tcW w:type="dxa" w:w="3700"/>
+            <w:tcMar>
+              <w:top w:type="dxa" w:w="80"/>
+              <w:left w:type="dxa" w:w="100"/>
+              <w:bottom w:type="dxa" w:w="80"/>
+              <w:right w:type="dxa" w:w="100"/>
+            </w:tcMar>
+          </w:tcPr>
+          <w:p>
+            <w:r>
+              <w:rPr>
+                <w:b w:val="false"/>
+                <w:bCs w:val="false"/>
+                <w:sz w:val="19"/>
+                <w:szCs w:val="19"/>
+              </w:rPr>
+              <w:t xml:space="preserve">Cortan pelo con una mano. Contestan WhatsApp con la otra.</w:t>
+            </w:r>
+          </w:p>
+        </w:tc>
+      </w:tr>
+      <w:tr>
+        <w:tc>
+          <w:tcPr>
+            <w:tcW w:type="dxa" w:w="1100"/>
+            <w:tcMar>
+              <w:top w:type="dxa" w:w="80"/>
+              <w:left w:type="dxa" w:w="100"/>
+              <w:bottom w:type="dxa" w:w="80"/>
+              <w:right w:type="dxa" w:w="100"/>
+            </w:tcMar>
+          </w:tcPr>
+          <w:p>
+            <w:r>
+              <w:rPr>
+                <w:b w:val="false"/>
+                <w:bCs w:val="false"/>
+                <w:sz w:val="19"/>
+                <w:szCs w:val="19"/>
+              </w:rPr>
+              <w:t xml:space="preserve">13-18 s</w:t>
+            </w:r>
+          </w:p>
+        </w:tc>
+        <w:tc>
+          <w:tcPr>
+            <w:tcW w:type="dxa" w:w="5666"/>
+            <w:tcMar>
+              <w:top w:type="dxa" w:w="80"/>
+              <w:left w:type="dxa" w:w="100"/>
+              <w:bottom w:type="dxa" w:w="80"/>
+              <w:right w:type="dxa" w:w="100"/>
+            </w:tcMar>
+          </w:tcPr>
+          <w:p>
+            <w:r>
+              <w:rPr>
+                <w:b w:val="false"/>
+                <w:bCs w:val="false"/>
+                <w:sz w:val="19"/>
+                <w:szCs w:val="19"/>
+              </w:rPr>
+              <w:t xml:space="preserve">“No es falta de talento ni de ganas: a una sola persona no le alcanzan las manos.”</w:t>
+            </w:r>
+          </w:p>
+        </w:tc>
+        <w:tc>
+          <w:tcPr>
+            <w:tcW w:type="dxa" w:w="3700"/>
+            <w:tcMar>
+              <w:top w:type="dxa" w:w="80"/>
+              <w:left w:type="dxa" w:w="100"/>
+              <w:bottom w:type="dxa" w:w="80"/>
+              <w:right w:type="dxa" w:w="100"/>
+            </w:tcMar>
+          </w:tcPr>
+          <w:p>
+            <w:r>
+              <w:rPr>
+                <w:b w:val="false"/>
+                <w:bCs w:val="false"/>
+                <w:sz w:val="19"/>
+                <w:szCs w:val="19"/>
+              </w:rPr>
+              <w:t xml:space="preserve">No es falta de talento. Es falta de manos.</w:t>
+            </w:r>
+          </w:p>
+        </w:tc>
+      </w:tr>
+      <w:tr>
+        <w:tc>
+          <w:tcPr>
+            <w:tcW w:type="dxa" w:w="1100"/>
+            <w:tcMar>
+              <w:top w:type="dxa" w:w="80"/>
+              <w:left w:type="dxa" w:w="100"/>
+              <w:bottom w:type="dxa" w:w="80"/>
+              <w:right w:type="dxa" w:w="100"/>
+            </w:tcMar>
+          </w:tcPr>
+          <w:p>
+            <w:r>
+              <w:rPr>
+                <w:b w:val="false"/>
+                <w:bCs w:val="false"/>
+                <w:sz w:val="19"/>
+                <w:szCs w:val="19"/>
+              </w:rPr>
+              <w:t xml:space="preserve">18-22 s</w:t>
+            </w:r>
+          </w:p>
+        </w:tc>
+        <w:tc>
+          <w:tcPr>
+            <w:tcW w:type="dxa" w:w="5666"/>
+            <w:tcMar>
+              <w:top w:type="dxa" w:w="80"/>
+              <w:left w:type="dxa" w:w="100"/>
+              <w:bottom w:type="dxa" w:w="80"/>
+              <w:right w:type="dxa" w:w="100"/>
+            </w:tcMar>
+          </w:tcPr>
+          <w:p>
+            <w:r>
+              <w:rPr>
+                <w:b w:val="false"/>
+                <w:bCs w:val="false"/>
+                <w:sz w:val="19"/>
+                <w:szCs w:val="19"/>
+              </w:rPr>
+              <w:t xml:space="preserve">“Estamos trabajando en algo para eso. Sígueme y te cuento.”</w:t>
+            </w:r>
+          </w:p>
+        </w:tc>
+        <w:tc>
+          <w:tcPr>
+            <w:tcW w:type="dxa" w:w="3700"/>
+            <w:tcMar>
+              <w:top w:type="dxa" w:w="80"/>
+              <w:left w:type="dxa" w:w="100"/>
+              <w:bottom w:type="dxa" w:w="80"/>
+              <w:right w:type="dxa" w:w="100"/>
+            </w:tcMar>
+          </w:tcPr>
+          <w:p>
+            <w:r>
+              <w:rPr>
+                <w:b w:val="false"/>
+                <w:bCs w:val="false"/>
+                <w:sz w:val="19"/>
+                <w:szCs w:val="19"/>
+              </w:rPr>
+              <w:t xml:space="preserve">Sígueme para lo que viene 👇</w:t>
+            </w:r>
+          </w:p>
+        </w:tc>
+      </w:tr>
+    </w:tbl>
+    <w:p>
+      <w:pPr>
+        <w:spacing w:after="120"/>
+      </w:pPr>
+      <w:r>
+        <w:rPr>
+          <w:b w:val="false"/>
+          <w:bCs w:val="false"/>
+          <w:i w:val="false"/>
+          <w:iCs w:val="false"/>
+        </w:rPr>
+        <w:t xml:space="preserve"/>
+      </w:r>
+    </w:p>
+    <w:p>
+      <w:pPr>
+        <w:spacing w:after="120"/>
+      </w:pPr>
+      <w:r>
+        <w:rPr>
+          <w:b w:val="false"/>
+          <w:bCs w:val="false"/>
+          <w:i/>
+          <w:iCs/>
+        </w:rPr>
+        <w:t xml:space="preserve">Honestidad: aún no hay clientes, así que el guion no afirma experiencia, contactos ni cifras: es una opinión. Sin pricing y sin nombrar el producto (“Iguana” solo aparece en el rótulo del nombre).</w:t>
+      </w:r>
+    </w:p>
+    <w:p>
+      <w:pPr>
+        <w:pStyle w:val="Heading2"/>
+        <w:spacing w:after="150" w:before="300"/>
+      </w:pPr>
+      <w:r>
+        <w:t xml:space="preserve">Cómo se graba y estilo</w:t>
       </w:r>
     </w:p>
     <w:p>
@@ -4326,7 +4516,7 @@
         <w:spacing w:after="80"/>
       </w:pPr>
       <w:r>
-        <w:t xml:space="preserve">Portada: frame del hook (seg. 0-2), mirada fija, boca cerrada o a media palabra; texto “No es tu trabajo. Es tu WhatsApp.” con “WhatsApp” en verde fosforescente. Elegir el cover manualmente.</w:t>
+        <w:t xml:space="preserve">Una toma continua de ≤ 22 s, 3 intentos, trípode a la altura de los ojos, plano medio. La persona de marketing sostiene la guía bajo el lente y cuenta el tiempo. Si el CEO se traba, repite desde el inicio de esa frase (son solo 62 palabras).</w:t>
       </w:r>
     </w:p>
     <w:p>
@@ -4339,7 +4529,7 @@
         <w:spacing w:after="80"/>
       </w:pPr>
       <w:r>
-        <w:t xml:space="preserve">Overlays: texto blanco con caja negra; verde en 1-2 palabras clave por texto, en el “2–5” del dato y en la flecha del CTA.</w:t>
+        <w:t xml:space="preserve">Luz de ventana, fondo simple con textura real, vestuario negro, blanco o neutro sin logos.</w:t>
       </w:r>
     </w:p>
     <w:p>
@@ -4352,7 +4542,7 @@
         <w:spacing w:after="80"/>
       </w:pPr>
       <w:r>
-        <w:t xml:space="preserve">Subtítulos quemados obligatorios (auto-captions de CapCut corregidos a mano), con ~250 px de margen inferior para los botones de Instagram.</w:t>
+        <w:t xml:space="preserve">Edición: punch-in leve en el segundo bloque; en cada texto, una sola palabra clave en verde fosforescente (“nadie”, “WhatsApp”, “manos”) y flecha verde animada hacia el botón de seguir.</w:t>
       </w:r>
     </w:p>
     <w:p>
@@ -4365,7 +4555,7 @@
         <w:spacing w:after="80"/>
       </w:pPr>
       <w:r>
-        <w:t xml:space="preserve">Antes de publicar: completar el nombre del CEO, verificar la fuente del dato y confirmar que no aparece pricing ni “Iguana” como producto (solo como nombre de quien habla).</w:t>
+        <w:t xml:space="preserve">Subtítulos quemados obligatorios (auto-captions corregidos a mano), con ~250 px de margen inferior. Portada elegida manualmente: frame de los primeros 2 s con el texto del hook.</w:t>
       </w:r>
     </w:p>
     <w:p>
@@ -4388,7 +4578,7 @@
           <w:i w:val="false"/>
           <w:iCs w:val="false"/>
         </w:rPr>
-        <w:t xml:space="preserve">No estás perdiendo clientes porque cortas mal el pelo, ni porque el servicio esté flojo, ni porque “la gente ya no es fiel”. Los estás perdiendo por WhatsApp. Un análisis del sector sobre salones en Latinoamérica calcula que pierden entre 2 y 5 citas por semana solo porque nadie alcanzó a contestar un mensaje a tiempo (fuente: Pronto). No es falta de talento ni de disciplina: le estamos pidiendo a una sola persona el trabajo de un negocio con cinco empleados. Esto sí tiene solución, y de eso voy a hablar pronto. ¿Cuántas citas crees que se te escapan a la semana? #NegociosEcuador #Emprendimiento #Quito #Guayaquil #WhatsAppBusiness</w:t>
+        <w:t xml:space="preserve">Las dueñas de peluquería tienen un segundo trabajo que nadie les paga: ser recepcionistas. Cortan pelo con una mano y contestan WhatsApp con la otra. No es falta de talento ni de ganas, es que a una sola persona no le alcanzan las manos. Estamos trabajando en algo para eso. Sígueme y te cuento. #NegociosEcuador #Emprendimiento #Quito #Guayaquil</w:t>
       </w:r>
     </w:p>
     <w:p>
@@ -5434,52 +5624,6 @@
                 <w:szCs w:val="19"/>
               </w:rPr>
               <w:t xml:space="preserve">Completar “[nombre]” en el guion y el overlay de la pieza 03.</w:t>
-            </w:r>
-          </w:p>
-        </w:tc>
-      </w:tr>
-      <w:tr>
-        <w:tc>
-          <w:tcPr>
-            <w:tcW w:type="dxa" w:w="3300"/>
-            <w:tcMar>
-              <w:top w:type="dxa" w:w="80"/>
-              <w:left w:type="dxa" w:w="100"/>
-              <w:bottom w:type="dxa" w:w="80"/>
-              <w:right w:type="dxa" w:w="100"/>
-            </w:tcMar>
-          </w:tcPr>
-          <w:p>
-            <w:r>
-              <w:rPr>
-                <w:b w:val="false"/>
-                <w:bCs w:val="false"/>
-                <w:sz w:val="19"/>
-                <w:szCs w:val="19"/>
-              </w:rPr>
-              <w:t xml:space="preserve">Fuente del dato 2–5 citas/semana</w:t>
-            </w:r>
-          </w:p>
-        </w:tc>
-        <w:tc>
-          <w:tcPr>
-            <w:tcW w:type="dxa" w:w="7166"/>
-            <w:tcMar>
-              <w:top w:type="dxa" w:w="80"/>
-              <w:left w:type="dxa" w:w="100"/>
-              <w:bottom w:type="dxa" w:w="80"/>
-              <w:right w:type="dxa" w:w="100"/>
-            </w:tcMar>
-          </w:tcPr>
-          <w:p>
-            <w:r>
-              <w:rPr>
-                <w:b w:val="false"/>
-                <w:bCs w:val="false"/>
-                <w:sz w:val="19"/>
-                <w:szCs w:val="19"/>
-              </w:rPr>
-              <w:t xml:space="preserve">Verificar el artículo de Pronto (salones de Latinoamérica) antes de publicar y citarlo con ese alcance.</w:t>
             </w:r>
           </w:p>
         </w:tc>

</xml_diff>